<commit_message>
Add pricing, unit economics, projectionsm and funding ask to business plan
</commit_message>
<xml_diff>
--- a/ShieldAI_Business_Plan_2026_Updated.docx
+++ b/ShieldAI_Business_Plan_2026_Updated.docx
@@ -2617,25 +2617,7 @@
           <w:color w:val="5A6B7B"/>
         </w:rPr>
         <w:lastRenderedPageBreak/>
-        <w:t xml:space="preserve">This plan reflects </w:t>
-      </w:r>
-      <w:proofErr w:type="spellStart"/>
-      <w:r>
-        <w:rPr>
-          <w:i/>
-          <w:iCs/>
-          <w:color w:val="5A6B7B"/>
-        </w:rPr>
-        <w:t>ShieldAI’s</w:t>
-      </w:r>
-      <w:proofErr w:type="spellEnd"/>
-      <w:r>
-        <w:rPr>
-          <w:i/>
-          <w:iCs/>
-          <w:color w:val="5A6B7B"/>
-        </w:rPr>
-        <w:t xml:space="preserve"> current direction: the self-serve product is built and functioning, and this </w:t>
+        <w:t xml:space="preserve">This plan reflects ShieldAI’s current direction: the self-serve product is built and functioning, and this </w:t>
       </w:r>
       <w:proofErr w:type="gramStart"/>
       <w:r>
@@ -2807,11 +2789,9 @@
         <w:pStyle w:val="Heading2"/>
       </w:pPr>
       <w:bookmarkStart w:id="5" w:name="_Toc232508588"/>
-      <w:proofErr w:type="gramStart"/>
-      <w:r>
-        <w:t>2.2  Market</w:t>
-      </w:r>
-      <w:proofErr w:type="gramEnd"/>
+      <w:r>
+        <w:t>2.2 Market</w:t>
+      </w:r>
       <w:r>
         <w:t xml:space="preserve"> Size</w:t>
       </w:r>
@@ -3358,11 +3338,9 @@
         <w:pStyle w:val="Heading2"/>
       </w:pPr>
       <w:bookmarkStart w:id="6" w:name="_Toc232508589"/>
-      <w:proofErr w:type="gramStart"/>
-      <w:r>
-        <w:t>2.3  Market</w:t>
-      </w:r>
-      <w:proofErr w:type="gramEnd"/>
+      <w:r>
+        <w:t>2.3 Market</w:t>
+      </w:r>
       <w:r>
         <w:t xml:space="preserve"> Sizing (Bottom-Up)</w:t>
       </w:r>
@@ -3406,11 +3384,9 @@
       <w:r>
         <w:t>SOM: A modest, credible early capture — e.g., 1% of a 600K-business SAM at a few thousand dollars per year per client — represents a business on the order of $20M+ in annual recurring revenue, reached over a 3–</w:t>
       </w:r>
-      <w:proofErr w:type="gramStart"/>
-      <w:r>
-        <w:t>5 year</w:t>
-      </w:r>
-      <w:proofErr w:type="gramEnd"/>
+      <w:r>
+        <w:t>5-year</w:t>
+      </w:r>
       <w:r>
         <w:t xml:space="preserve"> horizon via the self-serve-to-managed motion.</w:t>
       </w:r>
@@ -3433,11 +3409,9 @@
         <w:pStyle w:val="Heading2"/>
       </w:pPr>
       <w:bookmarkStart w:id="7" w:name="_Toc232508590"/>
-      <w:proofErr w:type="gramStart"/>
-      <w:r>
-        <w:t>2.4  Why</w:t>
-      </w:r>
-      <w:proofErr w:type="gramEnd"/>
+      <w:r>
+        <w:t>2.4 Why</w:t>
+      </w:r>
       <w:r>
         <w:t xml:space="preserve"> Now</w:t>
       </w:r>
@@ -3529,11 +3503,9 @@
         <w:pStyle w:val="Heading2"/>
       </w:pPr>
       <w:bookmarkStart w:id="9" w:name="_Toc232508592"/>
-      <w:proofErr w:type="gramStart"/>
-      <w:r>
-        <w:t>3.1  What</w:t>
-      </w:r>
-      <w:proofErr w:type="gramEnd"/>
+      <w:r>
+        <w:t>3.1 What</w:t>
+      </w:r>
       <w:r>
         <w:t xml:space="preserve"> the Customer Gets</w:t>
       </w:r>
@@ -3546,11 +3518,9 @@
       <w:r>
         <w:t xml:space="preserve">From a </w:t>
       </w:r>
-      <w:proofErr w:type="gramStart"/>
-      <w:r>
-        <w:t>short structured</w:t>
-      </w:r>
-      <w:proofErr w:type="gramEnd"/>
+      <w:r>
+        <w:t>short, structured</w:t>
+      </w:r>
       <w:r>
         <w:t xml:space="preserve"> assessment, ShieldAI produces a complete security program through a unified dashboard:</w:t>
       </w:r>
@@ -3639,11 +3609,9 @@
         <w:pStyle w:val="Heading2"/>
       </w:pPr>
       <w:bookmarkStart w:id="10" w:name="_Toc232508593"/>
-      <w:proofErr w:type="gramStart"/>
-      <w:r>
-        <w:t>3.2  The</w:t>
-      </w:r>
-      <w:proofErr w:type="gramEnd"/>
+      <w:r>
+        <w:t>3.2 The</w:t>
+      </w:r>
       <w:r>
         <w:t xml:space="preserve"> Scoring Engine — Our Core IP</w:t>
       </w:r>
@@ -3653,13 +3621,8 @@
       <w:pPr>
         <w:spacing w:after="140" w:line="276" w:lineRule="auto"/>
       </w:pPr>
-      <w:proofErr w:type="spellStart"/>
-      <w:r>
-        <w:t>ShieldAI’s</w:t>
-      </w:r>
-      <w:proofErr w:type="spellEnd"/>
-      <w:r>
-        <w:t xml:space="preserve"> differentiator is a deterministic risk-scoring engine built on the NIST Cybersecurity Framework. Unlike an AI that “guesses” a number, the engine computes a posture score across the five NIST functions — Identify, Protect, Detect, Respond, and Recover — each weighted and scored from the structured assessment. The same inputs always produce the same score, and every point traces to a specific control.</w:t>
+      <w:r>
+        <w:t>ShieldAI’s differentiator is a deterministic risk-scoring engine built on the NIST Cybersecurity Framework. Unlike an AI that “guesses” a number, the engine computes a posture score across the five NIST functions — Identify, Protect, Detect, Respond, and Recover — each weighted and scored from the structured assessment. The same inputs always produce the same score, and every point traces to a specific control.</w:t>
       </w:r>
     </w:p>
     <w:p>
@@ -3675,11 +3638,9 @@
         <w:pStyle w:val="Heading2"/>
       </w:pPr>
       <w:bookmarkStart w:id="11" w:name="_Toc232508594"/>
-      <w:proofErr w:type="gramStart"/>
-      <w:r>
-        <w:t>3.3  The</w:t>
-      </w:r>
-      <w:proofErr w:type="gramEnd"/>
+      <w:r>
+        <w:t>3.3 The</w:t>
+      </w:r>
       <w:r>
         <w:t xml:space="preserve"> Role of AI</w:t>
       </w:r>
@@ -3701,11 +3662,9 @@
       <w:r>
         <w:t>4</w:t>
       </w:r>
-      <w:proofErr w:type="gramStart"/>
-      <w:r>
-        <w:t>.  Strategy</w:t>
-      </w:r>
-      <w:proofErr w:type="gramEnd"/>
+      <w:r>
+        <w:t>. Strategy</w:t>
+      </w:r>
       <w:r>
         <w:t>: Wedge to Platform</w:t>
       </w:r>
@@ -3716,11 +3675,9 @@
         <w:pStyle w:val="Heading2"/>
       </w:pPr>
       <w:bookmarkStart w:id="13" w:name="_Toc232508596"/>
-      <w:proofErr w:type="gramStart"/>
-      <w:r>
-        <w:t>4.1  The</w:t>
-      </w:r>
-      <w:proofErr w:type="gramEnd"/>
+      <w:r>
+        <w:t>4.1 The</w:t>
+      </w:r>
       <w:r>
         <w:t xml:space="preserve"> Wedge — Self-Serve Product</w:t>
       </w:r>
@@ -3739,11 +3696,9 @@
         <w:pStyle w:val="Heading2"/>
       </w:pPr>
       <w:bookmarkStart w:id="14" w:name="_Toc232508597"/>
-      <w:proofErr w:type="gramStart"/>
-      <w:r>
-        <w:t>4.2  The</w:t>
-      </w:r>
-      <w:proofErr w:type="gramEnd"/>
+      <w:r>
+        <w:t>4.2 The</w:t>
+      </w:r>
       <w:r>
         <w:t xml:space="preserve"> Expansion — Managed vCISO Programs</w:t>
       </w:r>
@@ -3763,11 +3718,9 @@
         <w:pStyle w:val="Heading2"/>
       </w:pPr>
       <w:bookmarkStart w:id="15" w:name="_Toc232508598"/>
-      <w:proofErr w:type="gramStart"/>
-      <w:r>
-        <w:t>4.3  The</w:t>
-      </w:r>
-      <w:proofErr w:type="gramEnd"/>
+      <w:r>
+        <w:t>4.3 The</w:t>
+      </w:r>
       <w:r>
         <w:t xml:space="preserve"> Platform — The Analyst Console</w:t>
       </w:r>
@@ -3805,9 +3758,8 @@
           <w:sz w:val="24"/>
           <w:szCs w:val="24"/>
         </w:rPr>
-        <w:t xml:space="preserve">The AI does the first 80%. The engineer adds the high-value </w:t>
-      </w:r>
-      <w:proofErr w:type="gramStart"/>
+        <w:t xml:space="preserve">The AI does the first 80%. The engineer adds </w:t>
+      </w:r>
       <w:r>
         <w:rPr>
           <w:i/>
@@ -3816,9 +3768,28 @@
           <w:sz w:val="24"/>
           <w:szCs w:val="24"/>
         </w:rPr>
-        <w:t>20% —</w:t>
-      </w:r>
-      <w:proofErr w:type="gramEnd"/>
+        <w:t>high</w:t>
+      </w:r>
+      <w:r>
+        <w:rPr>
+          <w:i/>
+          <w:iCs/>
+          <w:color w:val="13315C"/>
+          <w:sz w:val="24"/>
+          <w:szCs w:val="24"/>
+        </w:rPr>
+        <w:t xml:space="preserve">-value </w:t>
+      </w:r>
+      <w:r>
+        <w:rPr>
+          <w:i/>
+          <w:iCs/>
+          <w:color w:val="13315C"/>
+          <w:sz w:val="24"/>
+          <w:szCs w:val="24"/>
+        </w:rPr>
+        <w:t>20%</w:t>
+      </w:r>
       <w:r>
         <w:rPr>
           <w:i/>
@@ -3829,7 +3800,6 @@
         </w:rPr>
         <w:t xml:space="preserve"> judgment, accountability, and </w:t>
       </w:r>
-      <w:proofErr w:type="gramStart"/>
       <w:r>
         <w:rPr>
           <w:i/>
@@ -3838,9 +3808,8 @@
           <w:sz w:val="24"/>
           <w:szCs w:val="24"/>
         </w:rPr>
-        <w:t>the client</w:t>
-      </w:r>
-      <w:proofErr w:type="gramEnd"/>
+        <w:t>client</w:t>
+      </w:r>
       <w:r>
         <w:rPr>
           <w:i/>
@@ -3860,11 +3829,9 @@
       <w:r>
         <w:t>5</w:t>
       </w:r>
-      <w:proofErr w:type="gramStart"/>
-      <w:r>
-        <w:t>.  Business</w:t>
-      </w:r>
-      <w:proofErr w:type="gramEnd"/>
+      <w:r>
+        <w:t>. Business</w:t>
+      </w:r>
       <w:r>
         <w:t xml:space="preserve"> Model</w:t>
       </w:r>
@@ -3875,11 +3842,9 @@
         <w:pStyle w:val="Heading2"/>
       </w:pPr>
       <w:bookmarkStart w:id="17" w:name="_Toc232508600"/>
-      <w:proofErr w:type="gramStart"/>
-      <w:r>
-        <w:t>5.1  Revenue</w:t>
-      </w:r>
-      <w:proofErr w:type="gramEnd"/>
+      <w:r>
+        <w:t>5.1 Revenue</w:t>
+      </w:r>
       <w:r>
         <w:t xml:space="preserve"> Streams</w:t>
       </w:r>
@@ -3942,11 +3907,9 @@
         <w:pStyle w:val="Heading2"/>
       </w:pPr>
       <w:bookmarkStart w:id="18" w:name="_Toc232508601"/>
-      <w:proofErr w:type="gramStart"/>
-      <w:r>
-        <w:t>5.2  Land</w:t>
-      </w:r>
-      <w:proofErr w:type="gramEnd"/>
+      <w:r>
+        <w:t>5.2 Land</w:t>
+      </w:r>
       <w:r>
         <w:t>-and-Expand Economics</w:t>
       </w:r>
@@ -3959,11 +3922,9 @@
       <w:r>
         <w:t xml:space="preserve">The model is designed to land small and expand: a business enters via the affordable self-serve tier and grows into managed plans as trust builds and requirements increase. Gross margins are high because AI performs the heavy lifting and engineers concentrate on high-value judgment. The managed tier carries a higher price and far better retention, since an </w:t>
       </w:r>
-      <w:proofErr w:type="gramStart"/>
-      <w:r>
-        <w:t>actively-managed</w:t>
-      </w:r>
-      <w:proofErr w:type="gramEnd"/>
+      <w:r>
+        <w:t>actively managed</w:t>
+      </w:r>
       <w:r>
         <w:t xml:space="preserve"> security program is continuously valuable rather than a one-time deliverable.</w:t>
       </w:r>
@@ -3989,11 +3950,9 @@
       <w:r>
         <w:t>6</w:t>
       </w:r>
-      <w:proofErr w:type="gramStart"/>
-      <w:r>
-        <w:t>.  Competitive</w:t>
-      </w:r>
-      <w:proofErr w:type="gramEnd"/>
+      <w:r>
+        <w:t>. Competitive</w:t>
+      </w:r>
       <w:r>
         <w:t xml:space="preserve"> Landscape &amp; Defensibility</w:t>
       </w:r>
@@ -4004,12 +3963,9 @@
         <w:pStyle w:val="Heading2"/>
       </w:pPr>
       <w:bookmarkStart w:id="20" w:name="_Toc232508603"/>
-      <w:proofErr w:type="gramStart"/>
-      <w:r>
-        <w:lastRenderedPageBreak/>
-        <w:t>6.1  The</w:t>
-      </w:r>
-      <w:proofErr w:type="gramEnd"/>
+      <w:r>
+        <w:t>6.1 The</w:t>
+      </w:r>
       <w:r>
         <w:t xml:space="preserve"> Landscape</w:t>
       </w:r>
@@ -4071,6 +4027,7 @@
                 <w:sz w:val="20"/>
                 <w:szCs w:val="20"/>
               </w:rPr>
+              <w:lastRenderedPageBreak/>
               <w:t>Category</w:t>
             </w:r>
           </w:p>
@@ -4713,11 +4670,9 @@
         <w:pStyle w:val="Heading2"/>
       </w:pPr>
       <w:bookmarkStart w:id="21" w:name="_Toc232508604"/>
-      <w:proofErr w:type="gramStart"/>
-      <w:r>
-        <w:t>6.2  Why</w:t>
-      </w:r>
-      <w:proofErr w:type="gramEnd"/>
+      <w:r>
+        <w:t>6.2 Why</w:t>
+      </w:r>
       <w:r>
         <w:t xml:space="preserve"> We Win</w:t>
       </w:r>
@@ -4788,11 +4743,9 @@
       <w:r>
         <w:t>7</w:t>
       </w:r>
-      <w:proofErr w:type="gramStart"/>
-      <w:r>
-        <w:t>.  Product</w:t>
-      </w:r>
-      <w:proofErr w:type="gramEnd"/>
+      <w:r>
+        <w:t>. Product</w:t>
+      </w:r>
       <w:r>
         <w:t xml:space="preserve"> Roadmap</w:t>
       </w:r>
@@ -4915,7 +4868,6 @@
       </w:pPr>
       <w:bookmarkStart w:id="25" w:name="_Toc232508608"/>
       <w:r>
-        <w:lastRenderedPageBreak/>
         <w:t>Phase 3 — Scale: Telemetry &amp; Automation</w:t>
       </w:r>
       <w:bookmarkEnd w:id="25"/>
@@ -4930,6 +4882,7 @@
         <w:spacing w:after="60" w:line="264" w:lineRule="auto"/>
       </w:pPr>
       <w:r>
+        <w:lastRenderedPageBreak/>
         <w:t>Deploy network agents in client environments for live posture and threat telemetry.</w:t>
       </w:r>
     </w:p>
@@ -4967,11 +4920,9 @@
       <w:r>
         <w:t>8</w:t>
       </w:r>
-      <w:proofErr w:type="gramStart"/>
-      <w:r>
-        <w:t>.  Team</w:t>
-      </w:r>
-      <w:proofErr w:type="gramEnd"/>
+      <w:r>
+        <w:t>. Team</w:t>
+      </w:r>
       <w:r>
         <w:t xml:space="preserve"> &amp; Execution</w:t>
       </w:r>
@@ -5081,15 +5032,7 @@
         <w:spacing w:after="60" w:line="264" w:lineRule="auto"/>
       </w:pPr>
       <w:r>
-        <w:t xml:space="preserve">Operations and compliance: pursue </w:t>
-      </w:r>
-      <w:proofErr w:type="spellStart"/>
-      <w:r>
-        <w:t>ShieldAI’s</w:t>
-      </w:r>
-      <w:proofErr w:type="spellEnd"/>
-      <w:r>
-        <w:t xml:space="preserve"> own SOC 2 posture and put appropriate scope, terms, and liability protections around the managed and self-serve tiers.</w:t>
+        <w:t>Operations and compliance: pursue ShieldAI’s own SOC 2 posture and put appropriate scope, terms, and liability protections around the managed and self-serve tiers.</w:t>
       </w:r>
     </w:p>
     <w:p>
@@ -5214,7 +5157,6 @@
                 <w:sz w:val="20"/>
                 <w:szCs w:val="20"/>
               </w:rPr>
-              <w:lastRenderedPageBreak/>
               <w:t>Risk</w:t>
             </w:r>
           </w:p>
@@ -5281,6 +5223,7 @@
                 <w:sz w:val="20"/>
                 <w:szCs w:val="20"/>
               </w:rPr>
+              <w:lastRenderedPageBreak/>
               <w:t>AI output accuracy / hallucination</w:t>
             </w:r>
           </w:p>

</xml_diff>